<commit_message>
fix: audit fixes for API errors, Wikidata caching, and clustering performance
- Preserve intended 400/404 HTTP status codes (were collapsing to 500)
- Return 404 for unknown actors instead of fabricated empty profiles
- Stop caching 'Unknown' nationality when a Wikidata batch fails, and
  raise the SPARQL timeout to 15s (failed batches now retry next run)
- Share one temporal filter + Louvain partition between the summary and
  community-details paths: no ID drift, no double clustering
- Hold the edge list in memory, cache clustering results per filter set,
  and vectorize the active_after filter (open-community: ~118s -> ~1s)
- Deterministic top-N tie-breaks so results reproduce across restarts
- Align report methodology text with the implemented popularity formula,
  disclose leaf-pruned path statistics, and regenerate the .docx
- polars: replace deprecated dtypes= with schema_overrides=

Co-Authored-By: Claude Fable 5 <noreply@anthropic.com>
</commit_message>
<xml_diff>
--- a/src/Hollywood_Data_Mining_Report.docx
+++ b/src/Hollywood_Data_Mining_Report.docx
@@ -477,7 +477,7 @@
         <w:br/>
       </w:r>
       <w:r>
-        <w:t>To test whether Kevin Bacon was truly the mathematical center of Hollywood when the game was invented, we filtered the graph for all films up to 1994 (1900–1994). We executed Breadth-First Search (BFS) graph traversals across the largest connected component to compute exact closeness centrality for the True Network Center, the Most Popular Actor of 1994, and Kevin Bacon.</w:t>
+        <w:t>To test whether Kevin Bacon was truly the mathematical center of Hollywood when the game was invented, we filtered the graph for all films up to 1994 (1900–1994). We executed Breadth-First Search (BFS) graph traversals across the largest connected component to compute closeness centrality for the True Network Center, the Most Popular Actor of 1994, and Kevin Bacon. For tractability, path statistics are computed on the leaf-pruned core of the component (degree-1 actors excluded); this leaves candidate rankings unaffected but makes absolute path lengths slightly optimistic.</w:t>
       </w:r>
     </w:p>
     <w:p>
@@ -563,7 +563,7 @@
         <w:br/>
       </w:r>
       <w:r>
-        <w:t>We re-ran the BFS shortest-path centrality analysis across the complete modern graph consisting of over 15.6 million edge pairs and 866,000 connected actors.</w:t>
+        <w:t>We re-ran the BFS shortest-path centrality analysis across the complete modern graph consisting of over 15.6 million edge pairs and 866,000 connected actors (path statistics again computed on the leaf-pruned core of the giant component).</w:t>
       </w:r>
     </w:p>
     <w:p>
@@ -674,15 +674,15 @@
         <w:br/>
       </w:r>
       <w:r>
-        <w:t>Measuring actor popularity across a century requires accounting for audience reception, film volume, and cast prominence. We formulated a weighted True Impact Score for actor a in target year Y:</w:t>
+        <w:t>Measuring actor popularity across a century requires accounting for audience reach, production scale, and cast prominence. We formulated a weighted True Impact Score for actor a in target year Y:</w:t>
         <w:br/>
-        <w:t>1. Rolling Window: Filtered films released in window [Y - 1, Y + 1] with vote count numVotes v &gt;= 1000.</w:t>
+        <w:t>1. Rolling Window: Filtered films (movies &amp; TV movies) released in window [Y - 1, Y + 1].</w:t>
         <w:br/>
-        <w:t>2. Film Impact Score: For each movie m, S_m = AverageRating * log10(numVotes).</w:t>
+        <w:t>2. Film Impact Score: For each movie m, S_m = log2(1 + CastSize) * log10(1 + numVotes), blending production scale with audience vote volume.</w:t>
         <w:br/>
-        <w:t>3. Cast Position Weight: Applied position decay w_pos = 1.0 for top billed, 0.8 for second, 0.6 for third, etc.</w:t>
+        <w:t>3. Cast Position Weight: Applied billing-order decay w_pos = 1 / ordering (1.0 for top billed, 0.5 for second, 0.33 for third, etc.), severely dampening minor roles.</w:t>
         <w:br/>
-        <w:t>4. Actor Yearly Score: Summed the Top 3 highest impact films for actor a in that window: Score(a, Y) = ∑ w_pos * S_m.</w:t>
+        <w:t>4. Actor Yearly Score: Summed the Top 3 highest weighted role scores in the window (scaled ×10) to reward quality over quantity: Score(a, Y) = 10 · ∑ w_pos * S_m.</w:t>
       </w:r>
     </w:p>
     <w:p>

</xml_diff>